<commit_message>
them giao dien dang tin , chi tiet tin
</commit_message>
<xml_diff>
--- a/docs/danh-sach-api-endpoint.docx
+++ b/docs/danh-sach-api-endpoint.docx
@@ -1615,18 +1615,8 @@
             </w:tcMar>
           </w:tcPr>
           <w:p>
-            <w:pPr>
-              <w:spacing w:after="0" w:line="240" w:lineRule="auto"/>
-              <w:jc w:val="left"/>
-            </w:pPr>
-            <w:r/>
-            <w:r>
-              <w:rPr>
-                <w:rFonts w:ascii="Arial" w:hAnsi="Arial" w:eastAsia="Arial"/>
-                <w:color w:val="000000"/>
-                <w:sz w:val="16"/>
-              </w:rPr>
-              <w:t>Tra cứu tin theo từ khóa, loại tin, danh mục, địa điểm, khoảng thời gian và phân trang</w:t>
+            <w:r>
+              <w:t>Tra cứu theo từ khóa, loại tin, danh mục, địa điểm, khoảng thời gian, trạng thái xử lý và phân trang</w:t>
             </w:r>
           </w:p>
         </w:tc>
@@ -2857,17 +2847,7 @@
             <w:shd w:fill="F2F7F4"/>
           </w:tcPr>
           <w:p>
-            <w:pPr>
-              <w:spacing w:after="0" w:line="240" w:lineRule="auto"/>
-              <w:jc w:val="left"/>
-            </w:pPr>
-            <w:r/>
-            <w:r>
-              <w:rPr>
-                <w:rFonts w:ascii="Arial" w:hAnsi="Arial" w:eastAsia="Arial"/>
-                <w:color w:val="000000"/>
-                <w:sz w:val="16"/>
-              </w:rPr>
+            <w:r>
               <w:t>Xem chi tiết tin của mình</w:t>
             </w:r>
           </w:p>
@@ -3197,17 +3177,7 @@
             <w:shd w:fill="F2F7F4"/>
           </w:tcPr>
           <w:p>
-            <w:pPr>
-              <w:spacing w:after="0" w:line="240" w:lineRule="auto"/>
-              <w:jc w:val="left"/>
-            </w:pPr>
-            <w:r/>
-            <w:r>
-              <w:rPr>
-                <w:rFonts w:ascii="Arial" w:hAnsi="Arial" w:eastAsia="Arial"/>
-                <w:color w:val="000000"/>
-                <w:sz w:val="16"/>
-              </w:rPr>
+            <w:r>
               <w:t>Cập nhật tin của mình</w:t>
             </w:r>
           </w:p>
@@ -3365,18 +3335,8 @@
             </w:tcMar>
           </w:tcPr>
           <w:p>
-            <w:pPr>
-              <w:spacing w:after="0" w:line="240" w:lineRule="auto"/>
-              <w:jc w:val="left"/>
-            </w:pPr>
-            <w:r/>
-            <w:r>
-              <w:rPr>
-                <w:rFonts w:ascii="Arial" w:hAnsi="Arial" w:eastAsia="Arial"/>
-                <w:color w:val="000000"/>
-                <w:sz w:val="16"/>
-              </w:rPr>
-              <w:t>Đóng tin khi không còn nhu cầu tìm hoặc tiếp nhận đồ</w:t>
+            <w:r>
+              <w:t>Đóng tin nhưng vẫn giữ lịch sử và các yêu cầu liên quan</w:t>
             </w:r>
           </w:p>
         </w:tc>
@@ -3537,18 +3497,8 @@
             <w:shd w:fill="F2F7F4"/>
           </w:tcPr>
           <w:p>
-            <w:pPr>
-              <w:spacing w:after="0" w:line="240" w:lineRule="auto"/>
-              <w:jc w:val="left"/>
-            </w:pPr>
-            <w:r/>
-            <w:r>
-              <w:rPr>
-                <w:rFonts w:ascii="Arial" w:hAnsi="Arial" w:eastAsia="Arial"/>
-                <w:color w:val="000000"/>
-                <w:sz w:val="16"/>
-              </w:rPr>
-              <w:t>Xóa mềm tin của mình nếu thỏa điều kiện</w:t>
+            <w:r>
+              <w:t>Xóa mềm tin chưa phát sinh yêu cầu nhận đồ hoặc bàn giao; nếu chỉ muốn ngừng hiển thị thì dùng API đóng tin</w:t>
             </w:r>
           </w:p>
         </w:tc>
@@ -10810,6 +10760,130 @@
           </w:p>
         </w:tc>
       </w:tr>
+      <w:tr>
+        <w:tc>
+          <w:tcPr>
+            <w:tcW w:type="dxa" w:w="605"/>
+          </w:tcPr>
+          <w:p>
+            <w:r>
+              <w:t>13</w:t>
+            </w:r>
+          </w:p>
+        </w:tc>
+        <w:tc>
+          <w:tcPr>
+            <w:tcW w:type="dxa" w:w="1656"/>
+          </w:tcPr>
+          <w:p>
+            <w:r>
+              <w:t>Báo cáo tin đăng</w:t>
+            </w:r>
+          </w:p>
+        </w:tc>
+        <w:tc>
+          <w:tcPr>
+            <w:tcW w:type="dxa" w:w="835"/>
+          </w:tcPr>
+          <w:p>
+            <w:r>
+              <w:t>POST</w:t>
+            </w:r>
+          </w:p>
+        </w:tc>
+        <w:tc>
+          <w:tcPr>
+            <w:tcW w:type="dxa" w:w="4536"/>
+          </w:tcPr>
+          <w:p>
+            <w:r>
+              <w:t>/api/v1/tin-dang/{id}/bao-cao</w:t>
+            </w:r>
+          </w:p>
+        </w:tc>
+        <w:tc>
+          <w:tcPr>
+            <w:tcW w:type="dxa" w:w="6365"/>
+          </w:tcPr>
+          <w:p>
+            <w:r>
+              <w:t>Người dùng gửi báo cáo tin kèm lý do và nội dung mô tả</w:t>
+            </w:r>
+          </w:p>
+        </w:tc>
+        <w:tc>
+          <w:tcPr>
+            <w:tcW w:type="dxa" w:w="1037"/>
+          </w:tcPr>
+          <w:p>
+            <w:r>
+              <w:t>New</w:t>
+            </w:r>
+          </w:p>
+        </w:tc>
+      </w:tr>
+      <w:tr>
+        <w:tc>
+          <w:tcPr>
+            <w:tcW w:type="dxa" w:w="605"/>
+          </w:tcPr>
+          <w:p>
+            <w:r>
+              <w:t>14</w:t>
+            </w:r>
+          </w:p>
+        </w:tc>
+        <w:tc>
+          <w:tcPr>
+            <w:tcW w:type="dxa" w:w="1656"/>
+          </w:tcPr>
+          <w:p>
+            <w:r>
+              <w:t>Admin - Tin đăng</w:t>
+            </w:r>
+          </w:p>
+        </w:tc>
+        <w:tc>
+          <w:tcPr>
+            <w:tcW w:type="dxa" w:w="835"/>
+          </w:tcPr>
+          <w:p>
+            <w:r>
+              <w:t>PATCH</w:t>
+            </w:r>
+          </w:p>
+        </w:tc>
+        <w:tc>
+          <w:tcPr>
+            <w:tcW w:type="dxa" w:w="4536"/>
+          </w:tcPr>
+          <w:p>
+            <w:r>
+              <w:t>/api/v1/admin/tin-dang/{id}/trang-thai</w:t>
+            </w:r>
+          </w:p>
+        </w:tc>
+        <w:tc>
+          <w:tcPr>
+            <w:tcW w:type="dxa" w:w="6365"/>
+          </w:tcPr>
+          <w:p>
+            <w:r>
+              <w:t>Cập nhật trạng thái nghiệp vụ của tin, gồm đã tìm lại hoặc đã bàn giao; chỉ cho phép chuyển trạng thái hợp lệ</w:t>
+            </w:r>
+          </w:p>
+        </w:tc>
+        <w:tc>
+          <w:tcPr>
+            <w:tcW w:type="dxa" w:w="1037"/>
+          </w:tcPr>
+          <w:p>
+            <w:r>
+              <w:t>New</w:t>
+            </w:r>
+          </w:p>
+        </w:tc>
+      </w:tr>
     </w:tbl>
     <w:p>
       <w:pPr>
@@ -13646,6 +13720,99 @@
           <w:sz w:val="4"/>
         </w:rPr>
         <w:t xml:space="preserve"> </w:t>
+      </w:r>
+    </w:p>
+    <w:p>
+      <w:pPr>
+        <w:pStyle w:val="Heading2"/>
+        <w:pageBreakBefore/>
+      </w:pPr>
+      <w:r>
+        <w:t>1.4.11. Quy tắc nghiệp vụ và phân quyền</w:t>
+      </w:r>
+    </w:p>
+    <w:p>
+      <w:pPr>
+        <w:pStyle w:val="ListBullet"/>
+      </w:pPr>
+      <w:r>
+        <w:rPr>
+          <w:b/>
+        </w:rPr>
+        <w:t xml:space="preserve">Báo cáo tin đăng: </w:t>
+      </w:r>
+      <w:r>
+        <w:t>Người dùng đã đăng nhập gửi báo cáo từ trang chi tiết tin qua POST /api/v1/tin-dang/{id}/bao-cao. Admin xem, xử lý và cập nhật kết quả bằng các API báo cáo hiện có.</w:t>
+      </w:r>
+    </w:p>
+    <w:p>
+      <w:pPr>
+        <w:pStyle w:val="ListBullet"/>
+      </w:pPr>
+      <w:r>
+        <w:rPr>
+          <w:b/>
+        </w:rPr>
+        <w:t xml:space="preserve">Tra cứu theo trạng thái: </w:t>
+      </w:r>
+      <w:r>
+        <w:t>GET /api/v1/tin-dang hỗ trợ lọc trạng thái xử lý, thống nhất với yêu cầu tìm kiếm trong phiếu đăng ký.</w:t>
+      </w:r>
+    </w:p>
+    <w:p>
+      <w:pPr>
+        <w:pStyle w:val="ListBullet"/>
+      </w:pPr>
+      <w:r>
+        <w:rPr>
+          <w:b/>
+        </w:rPr>
+        <w:t xml:space="preserve">Trạng thái hoàn tất: </w:t>
+      </w:r>
+      <w:r>
+        <w:t>Ẩn/khôi phục tin chỉ điều khiển khả năng hiển thị, không thay cho trạng thái nghiệp vụ. Khi xác nhận bàn giao thành công (bằng mã hoặc admin xác nhận thủ công), hệ thống cập nhật yêu cầu và tin liên quan sang trạng thái hoàn tất/đã bàn giao. Admin có thể cập nhật trạng thái tin qua API trạng thái mới; backend phải kiểm tra chuyển trạng thái hợp lệ.</w:t>
+      </w:r>
+    </w:p>
+    <w:p>
+      <w:pPr>
+        <w:pStyle w:val="ListBullet"/>
+      </w:pPr>
+      <w:r>
+        <w:rPr>
+          <w:b/>
+        </w:rPr>
+        <w:t xml:space="preserve">Đóng và xóa tin: </w:t>
+      </w:r>
+      <w:r>
+        <w:t>Đóng tin dùng khi muốn ngừng nhận yêu cầu nhưng cần giữ lịch sử. Xóa là xóa mềm và chỉ áp dụng cho tin chưa phát sinh yêu cầu nhận đồ hoặc bàn giao; nếu không cần hai hành vi riêng thì bỏ API DELETE tin.</w:t>
+      </w:r>
+    </w:p>
+    <w:p>
+      <w:pPr>
+        <w:pStyle w:val="ListBullet"/>
+      </w:pPr>
+      <w:r>
+        <w:rPr>
+          <w:b/>
+        </w:rPr>
+        <w:t xml:space="preserve">Danh mục và địa điểm: </w:t>
+      </w:r>
+      <w:r>
+        <w:t>Ngừng sử dụng/kích hoạt là xóa logic, không xóa dữ liệu đang được tin cũ tham chiếu; mục ngừng sử dụng không xuất hiện trong form tạo tin mới.</w:t>
+      </w:r>
+    </w:p>
+    <w:p>
+      <w:pPr>
+        <w:pStyle w:val="ListBullet"/>
+      </w:pPr>
+      <w:r>
+        <w:rPr>
+          <w:b/>
+        </w:rPr>
+        <w:t xml:space="preserve">Xác thực và quyền truy cập: </w:t>
+      </w:r>
+      <w:r>
+        <w:t>Các API cá nhân (/me) và API ghi dữ liệu yêu cầu đăng nhập; backend kiểm tra quyền sở hữu tin/yêu cầu. Các API /admin yêu cầu quyền quản trị. Chỉ các API tra cứu được xác định là công khai mới cho phép truy cập không cần đăng nhập.</w:t>
       </w:r>
     </w:p>
     <w:sectPr>

</xml_diff>